<commit_message>
Date 23-> sent for printing
</commit_message>
<xml_diff>
--- a/Received/lkg/lkg, projectwork.docx
+++ b/Received/lkg/lkg, projectwork.docx
@@ -2,6 +2,7 @@
 <file path=word/document.xml><?xml version="1.0" encoding="utf-8"?>
 <w:document xmlns:wpc="http://schemas.microsoft.com/office/word/2010/wordprocessingCanvas" xmlns:cx="http://schemas.microsoft.com/office/drawing/2014/chartex" xmlns:cx1="http://schemas.microsoft.com/office/drawing/2015/9/8/chartex" xmlns:cx2="http://schemas.microsoft.com/office/drawing/2015/10/21/chartex" xmlns:cx3="http://schemas.microsoft.com/office/drawing/2016/5/9/chartex" xmlns:cx4="http://schemas.microsoft.com/office/drawing/2016/5/10/chartex" xmlns:cx5="http://schemas.microsoft.com/office/drawing/2016/5/11/chartex" xmlns:cx6="http://schemas.microsoft.com/office/drawing/2016/5/12/chartex" xmlns:cx7="http://schemas.microsoft.com/office/drawing/2016/5/13/chartex" xmlns:cx8="http://schemas.microsoft.com/office/drawing/2016/5/14/chartex" xmlns:mc="http://schemas.openxmlformats.org/markup-compatibility/2006" xmlns:aink="http://schemas.microsoft.com/office/drawing/2016/ink" xmlns:am3d="http://schemas.microsoft.com/office/drawing/2017/model3d" xmlns:o="urn:schemas-microsoft-com:office:office" xmlns:oel="http://schemas.microsoft.com/office/2019/extlst" xmlns:r="http://schemas.openxmlformats.org/officeDocument/2006/relationships" xmlns:m="http://schemas.openxmlformats.org/officeDocument/2006/math" xmlns:v="urn:schemas-microsoft-com:vml" xmlns:wp14="http://schemas.microsoft.com/office/word/2010/wordprocessingDrawing" xmlns:wp="http://schemas.openxmlformats.org/drawingml/2006/wordprocessingDrawing" xmlns:w10="urn:schemas-microsoft-com:office:word" xmlns:w="http://schemas.openxmlformats.org/wordprocessingml/2006/main" xmlns:w14="http://schemas.microsoft.com/office/word/2010/wordml" xmlns:w15="http://schemas.microsoft.com/office/word/2012/wordml" xmlns:w16cex="http://schemas.microsoft.com/office/word/2018/wordml/cex" xmlns:w16cid="http://schemas.microsoft.com/office/word/2016/wordml/cid" xmlns:w16="http://schemas.microsoft.com/office/word/2018/wordml" xmlns:w16du="http://schemas.microsoft.com/office/word/2023/wordml/word16du" xmlns:w16sdtdh="http://schemas.microsoft.com/office/word/2020/wordml/sdtdatahash" xmlns:w16sdtfl="http://schemas.microsoft.com/office/word/2024/wordml/sdtformatlock" xmlns:w16se="http://schemas.microsoft.com/office/word/2015/wordml/symex" xmlns:wpg="http://schemas.microsoft.com/office/word/2010/wordprocessingGroup" xmlns:wpi="http://schemas.microsoft.com/office/word/2010/wordprocessingInk" xmlns:wne="http://schemas.microsoft.com/office/word/2006/wordml" xmlns:wps="http://schemas.microsoft.com/office/word/2010/wordprocessingShape" mc:Ignorable="w14 w15 w16se w16cid w16 w16cex w16sdtdh w16sdtfl w16du wp14">
   <w:body>
+    <w:bookmarkStart w:id="0" w:name="_Hlk138315100"/>
     <w:p>
       <w:pPr>
         <w:spacing w:after="0" w:line="240" w:lineRule="auto"/>
@@ -12,7 +13,6 @@
           <w:szCs w:val="36"/>
         </w:rPr>
       </w:pPr>
-      <w:bookmarkStart w:id="0" w:name="_Hlk138315100"/>
       <w:r>
         <w:rPr>
           <w:rFonts w:ascii="Preeti" w:hAnsi="Preeti"/>
@@ -272,27 +272,7 @@
           <w:sz w:val="24"/>
           <w:szCs w:val="24"/>
         </w:rPr>
-        <w:t xml:space="preserve">Ratnanagar-7, </w:t>
-      </w:r>
-      <w:proofErr w:type="spellStart"/>
-      <w:r>
-        <w:rPr>
-          <w:rFonts w:ascii="Times New Roman" w:hAnsi="Times New Roman" w:cs="Times New Roman"/>
-          <w:b/>
-          <w:sz w:val="24"/>
-          <w:szCs w:val="24"/>
-        </w:rPr>
-        <w:t>Sauraha</w:t>
-      </w:r>
-      <w:proofErr w:type="spellEnd"/>
-      <w:r>
-        <w:rPr>
-          <w:rFonts w:ascii="Times New Roman" w:hAnsi="Times New Roman" w:cs="Times New Roman"/>
-          <w:b/>
-          <w:sz w:val="24"/>
-          <w:szCs w:val="24"/>
-        </w:rPr>
-        <w:t>, Chitwan</w:t>
+        <w:t>Ratnanagar-7, Sauraha, Chitwan</w:t>
       </w:r>
     </w:p>
     <w:p>
@@ -1163,7 +1143,27 @@
           <w:sz w:val="32"/>
           <w:szCs w:val="32"/>
         </w:rPr>
-        <w:t>1. Join the dot and colour it.</w:t>
+        <w:t>1. Join the dot</w:t>
+      </w:r>
+      <w:r>
+        <w:rPr>
+          <w:rFonts w:ascii="Times New Roman" w:hAnsi="Times New Roman" w:cs="Times New Roman"/>
+          <w:b/>
+          <w:bCs/>
+          <w:sz w:val="32"/>
+          <w:szCs w:val="32"/>
+        </w:rPr>
+        <w:t>s</w:t>
+      </w:r>
+      <w:r>
+        <w:rPr>
+          <w:rFonts w:ascii="Times New Roman" w:hAnsi="Times New Roman" w:cs="Times New Roman"/>
+          <w:b/>
+          <w:bCs/>
+          <w:sz w:val="32"/>
+          <w:szCs w:val="32"/>
+        </w:rPr>
+        <w:t xml:space="preserve"> and colour it.</w:t>
       </w:r>
       <w:r>
         <w:rPr>
@@ -1645,17 +1645,27 @@
           <w:sz w:val="32"/>
           <w:szCs w:val="32"/>
         </w:rPr>
-        <w:t>Complete the given shape and colour it.</w:t>
-      </w:r>
-      <w:r>
-        <w:rPr>
-          <w:rFonts w:ascii="Times New Roman" w:hAnsi="Times New Roman" w:cs="Times New Roman"/>
-          <w:b/>
-          <w:bCs/>
-          <w:sz w:val="32"/>
-          <w:szCs w:val="32"/>
-        </w:rPr>
-        <w:tab/>
+        <w:t>Complete the given shape</w:t>
+      </w:r>
+      <w:r>
+        <w:rPr>
+          <w:rFonts w:ascii="Times New Roman" w:hAnsi="Times New Roman" w:cs="Times New Roman"/>
+          <w:b/>
+          <w:bCs/>
+          <w:sz w:val="32"/>
+          <w:szCs w:val="32"/>
+        </w:rPr>
+        <w:t>s</w:t>
+      </w:r>
+      <w:r>
+        <w:rPr>
+          <w:rFonts w:ascii="Times New Roman" w:hAnsi="Times New Roman" w:cs="Times New Roman"/>
+          <w:b/>
+          <w:bCs/>
+          <w:sz w:val="32"/>
+          <w:szCs w:val="32"/>
+        </w:rPr>
+        <w:t xml:space="preserve"> and colour it.</w:t>
       </w:r>
       <w:r>
         <w:rPr>
@@ -2150,7 +2160,7 @@
           <w:sz w:val="32"/>
           <w:szCs w:val="32"/>
         </w:rPr>
-        <w:t>Rectangle</w:t>
+        <w:t>Square</w:t>
       </w:r>
     </w:p>
     <w:p>
@@ -2190,13 +2200,13 @@
         <mc:AlternateContent>
           <mc:Choice Requires="wps">
             <w:drawing>
-              <wp:anchor distT="0" distB="0" distL="114300" distR="114300" simplePos="0" relativeHeight="251662336" behindDoc="0" locked="0" layoutInCell="1" allowOverlap="1" wp14:anchorId="4B41F46E" wp14:editId="5EAB0993">
+              <wp:anchor distT="0" distB="0" distL="114300" distR="114300" simplePos="0" relativeHeight="251662336" behindDoc="0" locked="0" layoutInCell="1" allowOverlap="1" wp14:anchorId="4B41F46E" wp14:editId="1F4C403D">
                 <wp:simplePos x="0" y="0"/>
                 <wp:positionH relativeFrom="column">
-                  <wp:posOffset>4970</wp:posOffset>
+                  <wp:posOffset>4445</wp:posOffset>
                 </wp:positionH>
                 <wp:positionV relativeFrom="paragraph">
-                  <wp:posOffset>265955</wp:posOffset>
+                  <wp:posOffset>74875</wp:posOffset>
                 </wp:positionV>
                 <wp:extent cx="1540565" cy="740465"/>
                 <wp:effectExtent l="0" t="0" r="21590" b="21590"/>
@@ -2245,7 +2255,7 @@
           </mc:Choice>
           <mc:Fallback>
             <w:pict>
-              <v:line w14:anchorId="254D0F4F" id="Straight Connector 7" o:spid="_x0000_s1026" style="position:absolute;z-index:251662336;visibility:visible;mso-wrap-style:square;mso-width-percent:0;mso-height-percent:0;mso-wrap-distance-left:9pt;mso-wrap-distance-top:0;mso-wrap-distance-right:9pt;mso-wrap-distance-bottom:0;mso-position-horizontal:absolute;mso-position-horizontal-relative:text;mso-position-vertical:absolute;mso-position-vertical-relative:text;mso-width-percent:0;mso-height-percent:0;mso-width-relative:margin;mso-height-relative:margin" from=".4pt,20.95pt" to="121.7pt,79.25pt" o:gfxdata="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" strokecolor="black [3200]" strokeweight="1pt">
+              <v:line w14:anchorId="71048546" id="Straight Connector 7" o:spid="_x0000_s1026" style="position:absolute;z-index:251662336;visibility:visible;mso-wrap-style:square;mso-width-percent:0;mso-height-percent:0;mso-wrap-distance-left:9pt;mso-wrap-distance-top:0;mso-wrap-distance-right:9pt;mso-wrap-distance-bottom:0;mso-position-horizontal:absolute;mso-position-horizontal-relative:text;mso-position-vertical:absolute;mso-position-vertical-relative:text;mso-width-percent:0;mso-height-percent:0;mso-width-relative:margin;mso-height-relative:margin" from=".35pt,5.9pt" to="121.65pt,64.2pt" o:gfxdata="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" strokecolor="black [3200]" strokeweight="1pt">
                 <v:stroke joinstyle="miter"/>
               </v:line>
             </w:pict>
@@ -2517,7 +2527,7 @@
         <mc:AlternateContent>
           <mc:Choice Requires="wps">
             <w:drawing>
-              <wp:anchor distT="0" distB="0" distL="114300" distR="114300" simplePos="0" relativeHeight="251675648" behindDoc="0" locked="0" layoutInCell="1" allowOverlap="1" wp14:anchorId="111CE1F5" wp14:editId="4B4B01C2">
+              <wp:anchor distT="0" distB="0" distL="114300" distR="114300" simplePos="0" relativeHeight="251675648" behindDoc="0" locked="0" layoutInCell="1" allowOverlap="1" wp14:anchorId="111CE1F5" wp14:editId="2DDF80AA">
                 <wp:simplePos x="0" y="0"/>
                 <wp:positionH relativeFrom="page">
                   <wp:posOffset>5000625</wp:posOffset>
@@ -2611,7 +2621,7 @@
         <mc:AlternateContent>
           <mc:Choice Requires="wps">
             <w:drawing>
-              <wp:anchor distT="0" distB="0" distL="114300" distR="114300" simplePos="0" relativeHeight="251671552" behindDoc="0" locked="0" layoutInCell="1" allowOverlap="1" wp14:anchorId="02146CAD" wp14:editId="63B5AA16">
+              <wp:anchor distT="0" distB="0" distL="114300" distR="114300" simplePos="0" relativeHeight="251671552" behindDoc="0" locked="0" layoutInCell="1" allowOverlap="1" wp14:anchorId="02146CAD" wp14:editId="11E8DFD4">
                 <wp:simplePos x="0" y="0"/>
                 <wp:positionH relativeFrom="margin">
                   <wp:align>left</wp:align>
@@ -2707,6 +2717,246 @@
           <w:lang w:val="en-US"/>
         </w:rPr>
       </w:pPr>
+      <w:r>
+        <w:rPr>
+          <w:rFonts w:ascii="Times New Roman" w:hAnsi="Times New Roman" w:cs="Times New Roman"/>
+          <w:noProof/>
+          <w:sz w:val="32"/>
+          <w:szCs w:val="32"/>
+          <w:lang w:val="en-US"/>
+        </w:rPr>
+        <mc:AlternateContent>
+          <mc:Choice Requires="wps">
+            <w:drawing>
+              <wp:anchor distT="45720" distB="45720" distL="114300" distR="114300" simplePos="0" relativeHeight="251691008" behindDoc="0" locked="0" layoutInCell="1" allowOverlap="1" wp14:anchorId="220C9A8A" wp14:editId="26ED7F21">
+                <wp:simplePos x="0" y="0"/>
+                <wp:positionH relativeFrom="column">
+                  <wp:posOffset>2059223</wp:posOffset>
+                </wp:positionH>
+                <wp:positionV relativeFrom="paragraph">
+                  <wp:posOffset>3853290</wp:posOffset>
+                </wp:positionV>
+                <wp:extent cx="445135" cy="389255"/>
+                <wp:effectExtent l="0" t="0" r="0" b="0"/>
+                <wp:wrapSquare wrapText="bothSides"/>
+                <wp:docPr id="1897596532" name="Text Box 2"/>
+                <wp:cNvGraphicFramePr>
+                  <a:graphicFrameLocks xmlns:a="http://schemas.openxmlformats.org/drawingml/2006/main"/>
+                </wp:cNvGraphicFramePr>
+                <a:graphic xmlns:a="http://schemas.openxmlformats.org/drawingml/2006/main">
+                  <a:graphicData uri="http://schemas.microsoft.com/office/word/2010/wordprocessingShape">
+                    <wps:wsp>
+                      <wps:cNvSpPr txBox="1">
+                        <a:spLocks noChangeArrowheads="1"/>
+                      </wps:cNvSpPr>
+                      <wps:spPr bwMode="auto">
+                        <a:xfrm>
+                          <a:off x="0" y="0"/>
+                          <a:ext cx="445135" cy="389255"/>
+                        </a:xfrm>
+                        <a:prstGeom prst="rect">
+                          <a:avLst/>
+                        </a:prstGeom>
+                        <a:noFill/>
+                        <a:ln w="9525">
+                          <a:noFill/>
+                          <a:miter lim="800000"/>
+                          <a:headEnd/>
+                          <a:tailEnd/>
+                        </a:ln>
+                      </wps:spPr>
+                      <wps:txbx>
+                        <w:txbxContent>
+                          <w:p>
+                            <w:pPr>
+                              <w:rPr>
+                                <w:rFonts w:ascii="Times New Roman" w:hAnsi="Times New Roman" w:cs="Times New Roman"/>
+                                <w:sz w:val="48"/>
+                                <w:szCs w:val="48"/>
+                                <w:lang w:val="en-US"/>
+                              </w:rPr>
+                            </w:pPr>
+                            <w:r>
+                              <w:rPr>
+                                <w:rFonts w:ascii="Times New Roman" w:hAnsi="Times New Roman" w:cs="Times New Roman"/>
+                                <w:sz w:val="48"/>
+                                <w:szCs w:val="48"/>
+                                <w:lang w:val="en-US"/>
+                              </w:rPr>
+                              <w:t>=</w:t>
+                            </w:r>
+                          </w:p>
+                        </w:txbxContent>
+                      </wps:txbx>
+                      <wps:bodyPr rot="0" vert="horz" wrap="square" lIns="91440" tIns="45720" rIns="91440" bIns="45720" anchor="t" anchorCtr="0">
+                        <a:noAutofit/>
+                      </wps:bodyPr>
+                    </wps:wsp>
+                  </a:graphicData>
+                </a:graphic>
+                <wp14:sizeRelH relativeFrom="margin">
+                  <wp14:pctWidth>0</wp14:pctWidth>
+                </wp14:sizeRelH>
+                <wp14:sizeRelV relativeFrom="margin">
+                  <wp14:pctHeight>0</wp14:pctHeight>
+                </wp14:sizeRelV>
+              </wp:anchor>
+            </w:drawing>
+          </mc:Choice>
+          <mc:Fallback>
+            <w:pict>
+              <v:shapetype w14:anchorId="220C9A8A" id="_x0000_t202" coordsize="21600,21600" o:spt="202" path="m,l,21600r21600,l21600,xe">
+                <v:stroke joinstyle="miter"/>
+                <v:path gradientshapeok="t" o:connecttype="rect"/>
+              </v:shapetype>
+              <v:shape id="_x0000_s1027" type="#_x0000_t202" style="position:absolute;margin-left:162.15pt;margin-top:303.4pt;width:35.05pt;height:30.65pt;z-index:251691008;visibility:visible;mso-wrap-style:square;mso-width-percent:0;mso-height-percent:0;mso-wrap-distance-left:9pt;mso-wrap-distance-top:3.6pt;mso-wrap-distance-right:9pt;mso-wrap-distance-bottom:3.6pt;mso-position-horizontal:absolute;mso-position-horizontal-relative:text;mso-position-vertical:absolute;mso-position-vertical-relative:text;mso-width-percent:0;mso-height-percent:0;mso-width-relative:margin;mso-height-relative:margin;v-text-anchor:top" o:gfxdata="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" filled="f" stroked="f">
+                <v:textbox>
+                  <w:txbxContent>
+                    <w:p>
+                      <w:pPr>
+                        <w:rPr>
+                          <w:rFonts w:ascii="Times New Roman" w:hAnsi="Times New Roman" w:cs="Times New Roman"/>
+                          <w:sz w:val="48"/>
+                          <w:szCs w:val="48"/>
+                          <w:lang w:val="en-US"/>
+                        </w:rPr>
+                      </w:pPr>
+                      <w:r>
+                        <w:rPr>
+                          <w:rFonts w:ascii="Times New Roman" w:hAnsi="Times New Roman" w:cs="Times New Roman"/>
+                          <w:sz w:val="48"/>
+                          <w:szCs w:val="48"/>
+                          <w:lang w:val="en-US"/>
+                        </w:rPr>
+                        <w:t>=</w:t>
+                      </w:r>
+                    </w:p>
+                  </w:txbxContent>
+                </v:textbox>
+                <w10:wrap type="square"/>
+              </v:shape>
+            </w:pict>
+          </mc:Fallback>
+        </mc:AlternateContent>
+      </w:r>
+      <w:r>
+        <w:rPr>
+          <w:rFonts w:ascii="Times New Roman" w:hAnsi="Times New Roman" w:cs="Times New Roman"/>
+          <w:noProof/>
+          <w:sz w:val="32"/>
+          <w:szCs w:val="32"/>
+          <w:lang w:val="en-US"/>
+        </w:rPr>
+        <mc:AlternateContent>
+          <mc:Choice Requires="wps">
+            <w:drawing>
+              <wp:anchor distT="45720" distB="45720" distL="114300" distR="114300" simplePos="0" relativeHeight="251688960" behindDoc="0" locked="0" layoutInCell="1" allowOverlap="1" wp14:anchorId="1F4F72C3" wp14:editId="4998F149">
+                <wp:simplePos x="0" y="0"/>
+                <wp:positionH relativeFrom="column">
+                  <wp:posOffset>1800391</wp:posOffset>
+                </wp:positionH>
+                <wp:positionV relativeFrom="paragraph">
+                  <wp:posOffset>179070</wp:posOffset>
+                </wp:positionV>
+                <wp:extent cx="445135" cy="389255"/>
+                <wp:effectExtent l="0" t="0" r="0" b="0"/>
+                <wp:wrapSquare wrapText="bothSides"/>
+                <wp:docPr id="217" name="Text Box 2"/>
+                <wp:cNvGraphicFramePr>
+                  <a:graphicFrameLocks xmlns:a="http://schemas.openxmlformats.org/drawingml/2006/main"/>
+                </wp:cNvGraphicFramePr>
+                <a:graphic xmlns:a="http://schemas.openxmlformats.org/drawingml/2006/main">
+                  <a:graphicData uri="http://schemas.microsoft.com/office/word/2010/wordprocessingShape">
+                    <wps:wsp>
+                      <wps:cNvSpPr txBox="1">
+                        <a:spLocks noChangeArrowheads="1"/>
+                      </wps:cNvSpPr>
+                      <wps:spPr bwMode="auto">
+                        <a:xfrm>
+                          <a:off x="0" y="0"/>
+                          <a:ext cx="445135" cy="389255"/>
+                        </a:xfrm>
+                        <a:prstGeom prst="rect">
+                          <a:avLst/>
+                        </a:prstGeom>
+                        <a:noFill/>
+                        <a:ln w="9525">
+                          <a:noFill/>
+                          <a:miter lim="800000"/>
+                          <a:headEnd/>
+                          <a:tailEnd/>
+                        </a:ln>
+                      </wps:spPr>
+                      <wps:txbx>
+                        <w:txbxContent>
+                          <w:p>
+                            <w:pPr>
+                              <w:rPr>
+                                <w:rFonts w:ascii="Times New Roman" w:hAnsi="Times New Roman" w:cs="Times New Roman"/>
+                                <w:sz w:val="48"/>
+                                <w:szCs w:val="48"/>
+                                <w:lang w:val="en-US"/>
+                              </w:rPr>
+                            </w:pPr>
+                            <w:r>
+                              <w:rPr>
+                                <w:rFonts w:ascii="Times New Roman" w:hAnsi="Times New Roman" w:cs="Times New Roman"/>
+                                <w:sz w:val="48"/>
+                                <w:szCs w:val="48"/>
+                                <w:lang w:val="en-US"/>
+                              </w:rPr>
+                              <w:t>=</w:t>
+                            </w:r>
+                          </w:p>
+                        </w:txbxContent>
+                      </wps:txbx>
+                      <wps:bodyPr rot="0" vert="horz" wrap="square" lIns="91440" tIns="45720" rIns="91440" bIns="45720" anchor="t" anchorCtr="0">
+                        <a:noAutofit/>
+                      </wps:bodyPr>
+                    </wps:wsp>
+                  </a:graphicData>
+                </a:graphic>
+                <wp14:sizeRelH relativeFrom="margin">
+                  <wp14:pctWidth>0</wp14:pctWidth>
+                </wp14:sizeRelH>
+                <wp14:sizeRelV relativeFrom="margin">
+                  <wp14:pctHeight>0</wp14:pctHeight>
+                </wp14:sizeRelV>
+              </wp:anchor>
+            </w:drawing>
+          </mc:Choice>
+          <mc:Fallback>
+            <w:pict>
+              <v:shape w14:anchorId="1F4F72C3" id="_x0000_s1028" type="#_x0000_t202" style="position:absolute;margin-left:141.75pt;margin-top:14.1pt;width:35.05pt;height:30.65pt;z-index:251688960;visibility:visible;mso-wrap-style:square;mso-width-percent:0;mso-height-percent:0;mso-wrap-distance-left:9pt;mso-wrap-distance-top:3.6pt;mso-wrap-distance-right:9pt;mso-wrap-distance-bottom:3.6pt;mso-position-horizontal:absolute;mso-position-horizontal-relative:text;mso-position-vertical:absolute;mso-position-vertical-relative:text;mso-width-percent:0;mso-height-percent:0;mso-width-relative:margin;mso-height-relative:margin;v-text-anchor:top" o:gfxdata="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" filled="f" stroked="f">
+                <v:textbox>
+                  <w:txbxContent>
+                    <w:p>
+                      <w:pPr>
+                        <w:rPr>
+                          <w:rFonts w:ascii="Times New Roman" w:hAnsi="Times New Roman" w:cs="Times New Roman"/>
+                          <w:sz w:val="48"/>
+                          <w:szCs w:val="48"/>
+                          <w:lang w:val="en-US"/>
+                        </w:rPr>
+                      </w:pPr>
+                      <w:r>
+                        <w:rPr>
+                          <w:rFonts w:ascii="Times New Roman" w:hAnsi="Times New Roman" w:cs="Times New Roman"/>
+                          <w:sz w:val="48"/>
+                          <w:szCs w:val="48"/>
+                          <w:lang w:val="en-US"/>
+                        </w:rPr>
+                        <w:t>=</w:t>
+                      </w:r>
+                    </w:p>
+                  </w:txbxContent>
+                </v:textbox>
+                <w10:wrap type="square"/>
+              </v:shape>
+            </w:pict>
+          </mc:Fallback>
+        </mc:AlternateContent>
+      </w:r>
       <w:r>
         <w:rPr>
           <w:rFonts w:ascii="Times New Roman" w:hAnsi="Times New Roman" w:cs="Times New Roman"/>
@@ -3039,7 +3289,27 @@
           <w:szCs w:val="32"/>
         </w:rPr>
         <w:lastRenderedPageBreak/>
-        <w:t>4. colour it. [10]</w:t>
+        <w:t xml:space="preserve">4. </w:t>
+      </w:r>
+      <w:r>
+        <w:rPr>
+          <w:rFonts w:ascii="Times New Roman" w:hAnsi="Times New Roman" w:cs="Times New Roman"/>
+          <w:b/>
+          <w:bCs/>
+          <w:sz w:val="32"/>
+          <w:szCs w:val="32"/>
+        </w:rPr>
+        <w:t>C</w:t>
+      </w:r>
+      <w:r>
+        <w:rPr>
+          <w:rFonts w:ascii="Times New Roman" w:hAnsi="Times New Roman" w:cs="Times New Roman"/>
+          <w:b/>
+          <w:bCs/>
+          <w:sz w:val="32"/>
+          <w:szCs w:val="32"/>
+        </w:rPr>
+        <w:t>olour it. [10]</w:t>
       </w:r>
     </w:p>
     <w:p>

</xml_diff>